<commit_message>
JIKM resubmission: fit 30-page cap (Table 9 -> Supplementary S4; figure sizing; spacing)
Author confirmed a 30-page limit. The designed-but-not-administered F4
protocol (Table 9) moved to the Supplementary Appendix as Table S4;
former Table 10 renumbered Table 9; in-text reference updated; cover
page (9 tables), cover letter (disclosed) and README updated. Figures
capped in height and paragraph spacing set to 1.10/6pt - presentation
only, paragraph text verified identical. Renders to 28 pages. Bundle
rebuilt.

Co-Authored-By: Claude Fable 5.1 <noreply@anthropic.com>
Claude-Session: https://claude.ai/code/session_01KoT3i8geZspYBMMKVYJUTG
</commit_message>
<xml_diff>
--- a/docs/papers/publication/jikm_submission_package/resubmission_2026-09-21/Paper2_JIKM_Manuscript_BLINDED_2026-09-20.docx
+++ b/docs/papers/publication/jikm_submission_package/resubmission_2026-09-21/Paper2_JIKM_Manuscript_BLINDED_2026-09-20.docx
@@ -803,7 +803,7 @@
       <w:r>
         <w:drawing>
           <wp:inline xmlns:a="http://schemas.openxmlformats.org/drawingml/2006/main" xmlns:pic="http://schemas.openxmlformats.org/drawingml/2006/picture">
-            <wp:extent cx="5040000" cy="3278639"/>
+            <wp:extent cx="4572000" cy="2974193"/>
             <wp:docPr id="1" name="Picture 1"/>
             <wp:cNvGraphicFramePr>
               <a:graphicFrameLocks noChangeAspect="1"/>
@@ -824,7 +824,7 @@
                   <pic:spPr>
                     <a:xfrm>
                       <a:off x="0" y="0"/>
-                      <a:ext cx="5040000" cy="3278639"/>
+                      <a:ext cx="4572000" cy="2974193"/>
                     </a:xfrm>
                     <a:prstGeom prst="rect"/>
                   </pic:spPr>
@@ -865,7 +865,7 @@
       <w:r>
         <w:drawing>
           <wp:inline xmlns:a="http://schemas.openxmlformats.org/drawingml/2006/main" xmlns:pic="http://schemas.openxmlformats.org/drawingml/2006/picture">
-            <wp:extent cx="5040000" cy="3261176"/>
+            <wp:extent cx="4572000" cy="2958352"/>
             <wp:docPr id="2" name="Picture 2"/>
             <wp:cNvGraphicFramePr>
               <a:graphicFrameLocks noChangeAspect="1"/>
@@ -886,7 +886,7 @@
                   <pic:spPr>
                     <a:xfrm>
                       <a:off x="0" y="0"/>
-                      <a:ext cx="5040000" cy="3261176"/>
+                      <a:ext cx="4572000" cy="2958352"/>
                     </a:xfrm>
                     <a:prstGeom prst="rect"/>
                   </pic:spPr>
@@ -914,7 +914,7 @@
       <w:r>
         <w:drawing>
           <wp:inline xmlns:a="http://schemas.openxmlformats.org/drawingml/2006/main" xmlns:pic="http://schemas.openxmlformats.org/drawingml/2006/picture">
-            <wp:extent cx="5040000" cy="5822070"/>
+            <wp:extent cx="2533024" cy="2926080"/>
             <wp:docPr id="3" name="Picture 3"/>
             <wp:cNvGraphicFramePr>
               <a:graphicFrameLocks noChangeAspect="1"/>
@@ -935,7 +935,7 @@
                   <pic:spPr>
                     <a:xfrm>
                       <a:off x="0" y="0"/>
-                      <a:ext cx="5040000" cy="5822070"/>
+                      <a:ext cx="2533024" cy="2926080"/>
                     </a:xfrm>
                     <a:prstGeom prst="rect"/>
                   </pic:spPr>
@@ -981,7 +981,7 @@
       <w:r>
         <w:drawing>
           <wp:inline xmlns:a="http://schemas.openxmlformats.org/drawingml/2006/main" xmlns:pic="http://schemas.openxmlformats.org/drawingml/2006/picture">
-            <wp:extent cx="5040000" cy="3380890"/>
+            <wp:extent cx="4572000" cy="3066950"/>
             <wp:docPr id="4" name="Picture 4"/>
             <wp:cNvGraphicFramePr>
               <a:graphicFrameLocks noChangeAspect="1"/>
@@ -1002,7 +1002,7 @@
                   <pic:spPr>
                     <a:xfrm>
                       <a:off x="0" y="0"/>
-                      <a:ext cx="5040000" cy="3380890"/>
+                      <a:ext cx="4572000" cy="3066950"/>
                     </a:xfrm>
                     <a:prstGeom prst="rect"/>
                   </pic:spPr>
@@ -2166,7 +2166,7 @@
       <w:r>
         <w:drawing>
           <wp:inline xmlns:a="http://schemas.openxmlformats.org/drawingml/2006/main" xmlns:pic="http://schemas.openxmlformats.org/drawingml/2006/picture">
-            <wp:extent cx="5040000" cy="3442623"/>
+            <wp:extent cx="4572000" cy="3122950"/>
             <wp:docPr id="5" name="Picture 5"/>
             <wp:cNvGraphicFramePr>
               <a:graphicFrameLocks noChangeAspect="1"/>
@@ -2187,7 +2187,7 @@
                   <pic:spPr>
                     <a:xfrm>
                       <a:off x="0" y="0"/>
-                      <a:ext cx="5040000" cy="3442623"/>
+                      <a:ext cx="4572000" cy="3122950"/>
                     </a:xfrm>
                     <a:prstGeom prst="rect"/>
                   </pic:spPr>
@@ -2976,7 +2976,7 @@
       <w:r>
         <w:drawing>
           <wp:inline xmlns:a="http://schemas.openxmlformats.org/drawingml/2006/main" xmlns:pic="http://schemas.openxmlformats.org/drawingml/2006/picture">
-            <wp:extent cx="5040000" cy="2974668"/>
+            <wp:extent cx="4572000" cy="2698448"/>
             <wp:docPr id="6" name="Picture 6"/>
             <wp:cNvGraphicFramePr>
               <a:graphicFrameLocks noChangeAspect="1"/>
@@ -2997,7 +2997,7 @@
                   <pic:spPr>
                     <a:xfrm>
                       <a:off x="0" y="0"/>
-                      <a:ext cx="5040000" cy="2974668"/>
+                      <a:ext cx="4572000" cy="2698448"/>
                     </a:xfrm>
                     <a:prstGeom prst="rect"/>
                   </pic:spPr>
@@ -3035,443 +3035,9 @@
     </w:p>
     <w:p>
       <w:r>
-        <w:t>A nine-question semi-structured interview protocol was designed for F4-cluster participants, to probe within days of a participant's last recorded run whether the decision to stop was immediate or deliberate (Table 9); questions 3 and 4 address H2 and H3, question 7 addresses H4, and question 9 probes domain reframing. The protocol was not administered in the present deployment - the F4 residents' negative reaction to the experience made a research interview inappropriate at the time - and no F4 interview data exist; it is specified for the confirmatory study. The deployment's qualitative record comprises the after-game paper questionnaire completed by all thirty participants (the source of the satisfaction data); post-deployment interviews with the nine sustained participants (August–September 2025; therapist-assisted, some by telephone; Mandarin or Cantonese via a paper interview questionnaire; the therapist-completed forms and centre logbook are the primary record); and three interviews with centre managers capturing the operator perspective. Themes were developed by the researcher from the contemporaneous field notes, compiled through near-daily contact with the therapists over the eight weeks; reported speech from the field notes and interview records is paraphrase unless explicitly marked as verbatim, and observations that run against the proposed mechanism are retained rather than reconciled away (Table 8). Because the sustained-participant interviews sample only those who continued — a subgroup defined by the outcome itself — their content can inform an account of persistence; it cannot establish the internal reasons of the participants who discontinued, which remain undocumented in this deployment and are assigned to the confirmatory study's interview protocol.</w:t>
+        <w:t>A nine-question semi-structured interview protocol was designed for F4-cluster participants, to probe within days of a participant's last recorded run whether the decision to stop was immediate or deliberate (Supplementary Table S4); questions 3 and 4 address H2 and H3, question 7 addresses H4, and question 9 probes domain reframing. The protocol was not administered in the present deployment - the F4 residents' negative reaction to the experience made a research interview inappropriate at the time - and no F4 interview data exist; it is specified for the confirmatory study. The deployment's qualitative record comprises the after-game paper questionnaire completed by all thirty participants (the source of the satisfaction data); post-deployment interviews with the nine sustained participants (August–September 2025; therapist-assisted, some by telephone; Mandarin or Cantonese via a paper interview questionnaire; the therapist-completed forms and centre logbook are the primary record); and three interviews with centre managers capturing the operator perspective. Themes were developed by the researcher from the contemporaneous field notes, compiled through near-daily contact with the therapists over the eight weeks; reported speech from the field notes and interview records is paraphrase unless explicitly marked as verbatim, and observations that run against the proposed mechanism are retained rather than reconciled away (Table 8). Because the sustained-participant interviews sample only those who continued — a subgroup defined by the outcome itself — their content can inform an account of persistence; it cannot establish the internal reasons of the participants who discontinued, which remain undocumented in this deployment and are assigned to the confirmatory study's interview protocol.</w:t>
       </w:r>
     </w:p>
-    <w:p>
-      <w:r>
-        <w:rPr>
-          <w:i/>
-          <w:sz w:val="18"/>
-        </w:rPr>
-        <w:t>Table 9. F4 interview protocol.</w:t>
-      </w:r>
-    </w:p>
-    <w:tbl>
-      <w:tblPr>
-        <w:tblStyle w:val="TableGrid"/>
-        <w:tblW w:type="auto" w:w="0"/>
-        <w:tblLook w:firstColumn="1" w:firstRow="1" w:lastColumn="0" w:lastRow="0" w:noHBand="0" w:noVBand="1" w:val="04A0"/>
-      </w:tblPr>
-      <w:tblGrid>
-        <w:gridCol w:w="2880"/>
-        <w:gridCol w:w="2880"/>
-        <w:gridCol w:w="2880"/>
-      </w:tblGrid>
-      <w:tr>
-        <w:tc>
-          <w:tcPr>
-            <w:tcW w:type="dxa" w:w="2880"/>
-          </w:tcPr>
-          <w:p>
-            <w:r>
-              <w:rPr>
-                <w:b/>
-                <w:sz w:val="18"/>
-              </w:rPr>
-              <w:t>Q</w:t>
-            </w:r>
-          </w:p>
-        </w:tc>
-        <w:tc>
-          <w:tcPr>
-            <w:tcW w:type="dxa" w:w="2880"/>
-          </w:tcPr>
-          <w:p>
-            <w:r>
-              <w:rPr>
-                <w:b/>
-                <w:sz w:val="18"/>
-              </w:rPr>
-              <w:t>Question</w:t>
-            </w:r>
-          </w:p>
-        </w:tc>
-        <w:tc>
-          <w:tcPr>
-            <w:tcW w:type="dxa" w:w="2880"/>
-          </w:tcPr>
-          <w:p>
-            <w:r>
-              <w:rPr>
-                <w:b/>
-                <w:sz w:val="18"/>
-              </w:rPr>
-              <w:t>Tests</w:t>
-            </w:r>
-          </w:p>
-        </w:tc>
-      </w:tr>
-      <w:tr>
-        <w:tc>
-          <w:tcPr>
-            <w:tcW w:type="dxa" w:w="2880"/>
-          </w:tcPr>
-          <w:p>
-            <w:r>
-              <w:rPr>
-                <w:sz w:val="18"/>
-              </w:rPr>
-              <w:t>1</w:t>
-            </w:r>
-          </w:p>
-        </w:tc>
-        <w:tc>
-          <w:tcPr>
-            <w:tcW w:type="dxa" w:w="2880"/>
-          </w:tcPr>
-          <w:p>
-            <w:r>
-              <w:rPr>
-                <w:sz w:val="18"/>
-              </w:rPr>
-              <w:t>Describe what happened in your last session</w:t>
-            </w:r>
-          </w:p>
-        </w:tc>
-        <w:tc>
-          <w:tcPr>
-            <w:tcW w:type="dxa" w:w="2880"/>
-          </w:tcPr>
-          <w:p>
-            <w:r>
-              <w:rPr>
-                <w:sz w:val="18"/>
-              </w:rPr>
-              <w:t>Account</w:t>
-            </w:r>
-          </w:p>
-        </w:tc>
-      </w:tr>
-      <w:tr>
-        <w:tc>
-          <w:tcPr>
-            <w:tcW w:type="dxa" w:w="2880"/>
-          </w:tcPr>
-          <w:p>
-            <w:r>
-              <w:rPr>
-                <w:sz w:val="18"/>
-              </w:rPr>
-              <w:t>2</w:t>
-            </w:r>
-          </w:p>
-        </w:tc>
-        <w:tc>
-          <w:tcPr>
-            <w:tcW w:type="dxa" w:w="2880"/>
-          </w:tcPr>
-          <w:p>
-            <w:r>
-              <w:rPr>
-                <w:sz w:val="18"/>
-              </w:rPr>
-              <w:t>How did you feel when the session ended?</w:t>
-            </w:r>
-          </w:p>
-        </w:tc>
-        <w:tc>
-          <w:tcPr>
-            <w:tcW w:type="dxa" w:w="2880"/>
-          </w:tcPr>
-          <w:p>
-            <w:r>
-              <w:rPr>
-                <w:sz w:val="18"/>
-              </w:rPr>
-              <w:t>Immediate anxiety</w:t>
-            </w:r>
-          </w:p>
-        </w:tc>
-      </w:tr>
-      <w:tr>
-        <w:tc>
-          <w:tcPr>
-            <w:tcW w:type="dxa" w:w="2880"/>
-          </w:tcPr>
-          <w:p>
-            <w:r>
-              <w:rPr>
-                <w:sz w:val="18"/>
-              </w:rPr>
-              <w:t>3</w:t>
-            </w:r>
-          </w:p>
-        </w:tc>
-        <w:tc>
-          <w:tcPr>
-            <w:tcW w:type="dxa" w:w="2880"/>
-          </w:tcPr>
-          <w:p>
-            <w:r>
-              <w:rPr>
-                <w:sz w:val="18"/>
-              </w:rPr>
-              <w:t>When did you decide not to come back?</w:t>
-            </w:r>
-          </w:p>
-        </w:tc>
-        <w:tc>
-          <w:tcPr>
-            <w:tcW w:type="dxa" w:w="2880"/>
-          </w:tcPr>
-          <w:p>
-            <w:r>
-              <w:rPr>
-                <w:sz w:val="18"/>
-              </w:rPr>
-              <w:t>H2: impulsive vs deliberate</w:t>
-            </w:r>
-          </w:p>
-        </w:tc>
-      </w:tr>
-      <w:tr>
-        <w:tc>
-          <w:tcPr>
-            <w:tcW w:type="dxa" w:w="2880"/>
-          </w:tcPr>
-          <w:p>
-            <w:r>
-              <w:rPr>
-                <w:sz w:val="18"/>
-              </w:rPr>
-              <w:t>4</w:t>
-            </w:r>
-          </w:p>
-        </w:tc>
-        <w:tc>
-          <w:tcPr>
-            <w:tcW w:type="dxa" w:w="2880"/>
-          </w:tcPr>
-          <w:p>
-            <w:r>
-              <w:rPr>
-                <w:sz w:val="18"/>
-              </w:rPr>
-              <w:t>What were you thinking about your performance?</w:t>
-            </w:r>
-          </w:p>
-        </w:tc>
-        <w:tc>
-          <w:tcPr>
-            <w:tcW w:type="dxa" w:w="2880"/>
-          </w:tcPr>
-          <w:p>
-            <w:r>
-              <w:rPr>
-                <w:sz w:val="18"/>
-              </w:rPr>
-              <w:t>H3: health identity</w:t>
-            </w:r>
-          </w:p>
-        </w:tc>
-      </w:tr>
-      <w:tr>
-        <w:tc>
-          <w:tcPr>
-            <w:tcW w:type="dxa" w:w="2880"/>
-          </w:tcPr>
-          <w:p>
-            <w:r>
-              <w:rPr>
-                <w:sz w:val="18"/>
-              </w:rPr>
-              <w:t>5</w:t>
-            </w:r>
-          </w:p>
-        </w:tc>
-        <w:tc>
-          <w:tcPr>
-            <w:tcW w:type="dxa" w:w="2880"/>
-          </w:tcPr>
-          <w:p>
-            <w:r>
-              <w:rPr>
-                <w:sz w:val="18"/>
-              </w:rPr>
-              <w:t>Did others' opinions matter?</w:t>
-            </w:r>
-          </w:p>
-        </w:tc>
-        <w:tc>
-          <w:tcPr>
-            <w:tcW w:type="dxa" w:w="2880"/>
-          </w:tcPr>
-          <w:p>
-            <w:r>
-              <w:rPr>
-                <w:sz w:val="18"/>
-              </w:rPr>
-              <w:t>Social comparison</w:t>
-            </w:r>
-          </w:p>
-        </w:tc>
-      </w:tr>
-      <w:tr>
-        <w:tc>
-          <w:tcPr>
-            <w:tcW w:type="dxa" w:w="2880"/>
-          </w:tcPr>
-          <w:p>
-            <w:r>
-              <w:rPr>
-                <w:sz w:val="18"/>
-              </w:rPr>
-              <w:t>6</w:t>
-            </w:r>
-          </w:p>
-        </w:tc>
-        <w:tc>
-          <w:tcPr>
-            <w:tcW w:type="dxa" w:w="2880"/>
-          </w:tcPr>
-          <w:p>
-            <w:r>
-              <w:rPr>
-                <w:sz w:val="18"/>
-              </w:rPr>
-              <w:t>Did you connect difficulty to your age?</w:t>
-            </w:r>
-          </w:p>
-        </w:tc>
-        <w:tc>
-          <w:tcPr>
-            <w:tcW w:type="dxa" w:w="2880"/>
-          </w:tcPr>
-          <w:p>
-            <w:r>
-              <w:rPr>
-                <w:sz w:val="18"/>
-              </w:rPr>
-              <w:t>Age attribution</w:t>
-            </w:r>
-          </w:p>
-        </w:tc>
-      </w:tr>
-      <w:tr>
-        <w:tc>
-          <w:tcPr>
-            <w:tcW w:type="dxa" w:w="2880"/>
-          </w:tcPr>
-          <w:p>
-            <w:r>
-              <w:rPr>
-                <w:sz w:val="18"/>
-              </w:rPr>
-              <w:t>7</w:t>
-            </w:r>
-          </w:p>
-        </w:tc>
-        <w:tc>
-          <w:tcPr>
-            <w:tcW w:type="dxa" w:w="2880"/>
-          </w:tcPr>
-          <w:p>
-            <w:r>
-              <w:rPr>
-                <w:sz w:val="18"/>
-              </w:rPr>
-              <w:t>If easier, would you have continued?</w:t>
-            </w:r>
-          </w:p>
-        </w:tc>
-        <w:tc>
-          <w:tcPr>
-            <w:tcW w:type="dxa" w:w="2880"/>
-          </w:tcPr>
-          <w:p>
-            <w:r>
-              <w:rPr>
-                <w:sz w:val="18"/>
-              </w:rPr>
-              <w:t>H4: technical vs psychological</w:t>
-            </w:r>
-          </w:p>
-        </w:tc>
-      </w:tr>
-      <w:tr>
-        <w:tc>
-          <w:tcPr>
-            <w:tcW w:type="dxa" w:w="2880"/>
-          </w:tcPr>
-          <w:p>
-            <w:r>
-              <w:rPr>
-                <w:sz w:val="18"/>
-              </w:rPr>
-              <w:t>8</w:t>
-            </w:r>
-          </w:p>
-        </w:tc>
-        <w:tc>
-          <w:tcPr>
-            <w:tcW w:type="dxa" w:w="2880"/>
-          </w:tcPr>
-          <w:p>
-            <w:r>
-              <w:rPr>
-                <w:sz w:val="18"/>
-              </w:rPr>
-              <w:t>Anything that would make you try again?</w:t>
-            </w:r>
-          </w:p>
-        </w:tc>
-        <w:tc>
-          <w:tcPr>
-            <w:tcW w:type="dxa" w:w="2880"/>
-          </w:tcPr>
-          <w:p>
-            <w:r>
-              <w:rPr>
-                <w:sz w:val="18"/>
-              </w:rPr>
-              <w:t>Permanence</w:t>
-            </w:r>
-          </w:p>
-        </w:tc>
-      </w:tr>
-      <w:tr>
-        <w:tc>
-          <w:tcPr>
-            <w:tcW w:type="dxa" w:w="2880"/>
-          </w:tcPr>
-          <w:p>
-            <w:r>
-              <w:rPr>
-                <w:sz w:val="18"/>
-              </w:rPr>
-              <w:t>9</w:t>
-            </w:r>
-          </w:p>
-        </w:tc>
-        <w:tc>
-          <w:tcPr>
-            <w:tcW w:type="dxa" w:w="2880"/>
-          </w:tcPr>
-          <w:p>
-            <w:r>
-              <w:rPr>
-                <w:sz w:val="18"/>
-              </w:rPr>
-              <w:t>If described as a reaction-speed game instead of a health test, would that change how you felt?</w:t>
-            </w:r>
-          </w:p>
-        </w:tc>
-        <w:tc>
-          <w:tcPr>
-            <w:tcW w:type="dxa" w:w="2880"/>
-          </w:tcPr>
-          <w:p>
-            <w:r>
-              <w:rPr>
-                <w:sz w:val="18"/>
-              </w:rPr>
-              <w:t>Domain-reframing probe</w:t>
-            </w:r>
-          </w:p>
-        </w:tc>
-      </w:tr>
-    </w:tbl>
     <w:p>
       <w:pPr>
         <w:pStyle w:val="Heading1"/>
@@ -3511,13 +3077,13 @@
         <w:jc w:val="both"/>
       </w:pPr>
       <w:r>
-        <w:t>Table 10 assembles this qualitative record systematically, pairing each finding with the record that supports it and with the principal alternative interpretation. The designed F4 interview protocol was never administered (Section X), so no F4 interview material appears; contradictory cases are retained in the table rather than reconciled away.</w:t>
+        <w:t>Table 9 assembles this qualitative record systematically, pairing each finding with the record that supports it and with the principal alternative interpretation. The designed F4 interview protocol was never administered (Section X), so no F4 interview material appears; contradictory cases are retained in the table rather than reconciled away.</w:t>
       </w:r>
     </w:p>
     <w:p>
       <w:pPr/>
       <w:r>
-        <w:t>Table 10. Qualitative findings, supporting records, and alternative interpretations.</w:t>
+        <w:t>Table 9. Qualitative findings, supporting records, and alternative interpretations.</w:t>
       </w:r>
     </w:p>
     <w:tbl>
@@ -3822,7 +3388,7 @@
       <w:r>
         <w:drawing>
           <wp:inline xmlns:a="http://schemas.openxmlformats.org/drawingml/2006/main" xmlns:pic="http://schemas.openxmlformats.org/drawingml/2006/picture">
-            <wp:extent cx="5040000" cy="6061622"/>
+            <wp:extent cx="2584977" cy="3108960"/>
             <wp:docPr id="7" name="Picture 7"/>
             <wp:cNvGraphicFramePr>
               <a:graphicFrameLocks noChangeAspect="1"/>
@@ -3843,7 +3409,7 @@
                   <pic:spPr>
                     <a:xfrm>
                       <a:off x="0" y="0"/>
-                      <a:ext cx="5040000" cy="6061622"/>
+                      <a:ext cx="2584977" cy="3108960"/>
                     </a:xfrm>
                     <a:prstGeom prst="rect"/>
                   </pic:spPr>
@@ -3994,7 +3560,7 @@
       <w:r>
         <w:drawing>
           <wp:inline xmlns:a="http://schemas.openxmlformats.org/drawingml/2006/main" xmlns:pic="http://schemas.openxmlformats.org/drawingml/2006/picture">
-            <wp:extent cx="5040000" cy="4530909"/>
+            <wp:extent cx="3458281" cy="3108960"/>
             <wp:docPr id="8" name="Picture 8"/>
             <wp:cNvGraphicFramePr>
               <a:graphicFrameLocks noChangeAspect="1"/>
@@ -4015,7 +3581,7 @@
                   <pic:spPr>
                     <a:xfrm>
                       <a:off x="0" y="0"/>
-                      <a:ext cx="5040000" cy="4530909"/>
+                      <a:ext cx="3458281" cy="3108960"/>
                     </a:xfrm>
                     <a:prstGeom prst="rect"/>
                   </pic:spPr>
@@ -4577,7 +4143,7 @@
     </w:rPrDefault>
     <w:pPrDefault>
       <w:pPr>
-        <w:spacing w:after="200" w:line="276" w:lineRule="auto"/>
+        <w:spacing w:after="120" w:line="264" w:lineRule="auto"/>
       </w:pPr>
     </w:pPrDefault>
   </w:docDefaults>

</xml_diff>